<commit_message>
backup antes de objetivos y fuentes
</commit_message>
<xml_diff>
--- a/planeaciones-nautica/public/templates/F-32.docx
+++ b/planeaciones-nautica/public/templates/F-32.docx
@@ -98,6 +98,12 @@
                 <w:rFonts w:ascii="Arial" w:eastAsia="Montserrat" w:hAnsi="Arial" w:cs="Arial"/>
               </w:rPr>
             </w:pPr>
+            <w:r>
+              <w:rPr>
+                <w:rFonts w:ascii="Arial" w:eastAsia="Montserrat" w:hAnsi="Arial" w:cs="Arial"/>
+              </w:rPr>
+              <w:t>{periodo}</w:t>
+            </w:r>
           </w:p>
         </w:tc>
       </w:tr>
@@ -228,7 +234,21 @@
               <w:rPr>
                 <w:rFonts w:ascii="Arial" w:eastAsia="Montserrat" w:hAnsi="Arial" w:cs="Arial"/>
               </w:rPr>
-              <w:t>{escuela}</w:t>
+              <w:t>{</w:t>
+            </w:r>
+            <w:proofErr w:type="spellStart"/>
+            <w:r>
+              <w:rPr>
+                <w:rFonts w:ascii="Arial" w:eastAsia="Montserrat" w:hAnsi="Arial" w:cs="Arial"/>
+              </w:rPr>
+              <w:t>escuelaNautica</w:t>
+            </w:r>
+            <w:proofErr w:type="spellEnd"/>
+            <w:r>
+              <w:rPr>
+                <w:rFonts w:ascii="Arial" w:eastAsia="Montserrat" w:hAnsi="Arial" w:cs="Arial"/>
+              </w:rPr>
+              <w:t>}</w:t>
             </w:r>
           </w:p>
         </w:tc>
@@ -272,6 +292,12 @@
                 <w:rFonts w:ascii="Arial" w:eastAsia="Montserrat" w:hAnsi="Arial" w:cs="Arial"/>
               </w:rPr>
             </w:pPr>
+            <w:r>
+              <w:rPr>
+                <w:rFonts w:ascii="Arial" w:eastAsia="Montserrat" w:hAnsi="Arial" w:cs="Arial"/>
+              </w:rPr>
+              <w:t>{cadetes}</w:t>
+            </w:r>
           </w:p>
         </w:tc>
       </w:tr>
@@ -319,6 +345,12 @@
                 <w:rFonts w:ascii="Arial" w:eastAsia="Montserrat" w:hAnsi="Arial" w:cs="Arial"/>
               </w:rPr>
             </w:pPr>
+            <w:r>
+              <w:rPr>
+                <w:rFonts w:ascii="Arial" w:eastAsia="Montserrat" w:hAnsi="Arial" w:cs="Arial"/>
+              </w:rPr>
+              <w:t>{docente}</w:t>
+            </w:r>
           </w:p>
         </w:tc>
       </w:tr>
@@ -363,7 +395,21 @@
               <w:rPr>
                 <w:rFonts w:ascii="Arial" w:eastAsia="Montserrat" w:hAnsi="Arial" w:cs="Arial"/>
               </w:rPr>
-              <w:t>{horasTotales}</w:t>
+              <w:t>{</w:t>
+            </w:r>
+            <w:proofErr w:type="spellStart"/>
+            <w:r>
+              <w:rPr>
+                <w:rFonts w:ascii="Arial" w:eastAsia="Montserrat" w:hAnsi="Arial" w:cs="Arial"/>
+              </w:rPr>
+              <w:t>horasTotales</w:t>
+            </w:r>
+            <w:proofErr w:type="spellEnd"/>
+            <w:r>
+              <w:rPr>
+                <w:rFonts w:ascii="Arial" w:eastAsia="Montserrat" w:hAnsi="Arial" w:cs="Arial"/>
+              </w:rPr>
+              <w:t>}</w:t>
             </w:r>
           </w:p>
         </w:tc>
@@ -435,7 +481,21 @@
               <w:rPr>
                 <w:rFonts w:ascii="Arial" w:eastAsia="Montserrat" w:hAnsi="Arial" w:cs="Arial"/>
               </w:rPr>
-              <w:t>{horasTeoricas}</w:t>
+              <w:t>{</w:t>
+            </w:r>
+            <w:proofErr w:type="spellStart"/>
+            <w:r>
+              <w:rPr>
+                <w:rFonts w:ascii="Arial" w:eastAsia="Montserrat" w:hAnsi="Arial" w:cs="Arial"/>
+              </w:rPr>
+              <w:t>horasTeoricas</w:t>
+            </w:r>
+            <w:proofErr w:type="spellEnd"/>
+            <w:r>
+              <w:rPr>
+                <w:rFonts w:ascii="Arial" w:eastAsia="Montserrat" w:hAnsi="Arial" w:cs="Arial"/>
+              </w:rPr>
+              <w:t>}</w:t>
             </w:r>
           </w:p>
         </w:tc>
@@ -477,7 +537,21 @@
               <w:rPr>
                 <w:rFonts w:ascii="Arial" w:eastAsia="Montserrat" w:hAnsi="Arial" w:cs="Arial"/>
               </w:rPr>
-              <w:t>{horasPracticas}</w:t>
+              <w:t>{</w:t>
+            </w:r>
+            <w:proofErr w:type="spellStart"/>
+            <w:r>
+              <w:rPr>
+                <w:rFonts w:ascii="Arial" w:eastAsia="Montserrat" w:hAnsi="Arial" w:cs="Arial"/>
+              </w:rPr>
+              <w:t>horasPracticas</w:t>
+            </w:r>
+            <w:proofErr w:type="spellEnd"/>
+            <w:r>
+              <w:rPr>
+                <w:rFonts w:ascii="Arial" w:eastAsia="Montserrat" w:hAnsi="Arial" w:cs="Arial"/>
+              </w:rPr>
+              <w:t>}</w:t>
             </w:r>
           </w:p>
         </w:tc>
@@ -559,7 +633,21 @@
               <w:rPr>
                 <w:rFonts w:ascii="Arial" w:eastAsia="Montserrat" w:hAnsi="Arial" w:cs="Arial"/>
               </w:rPr>
-              <w:t>{horasSemana}</w:t>
+              <w:t>{</w:t>
+            </w:r>
+            <w:proofErr w:type="spellStart"/>
+            <w:r>
+              <w:rPr>
+                <w:rFonts w:ascii="Arial" w:eastAsia="Montserrat" w:hAnsi="Arial" w:cs="Arial"/>
+              </w:rPr>
+              <w:t>horasSemana</w:t>
+            </w:r>
+            <w:proofErr w:type="spellEnd"/>
+            <w:r>
+              <w:rPr>
+                <w:rFonts w:ascii="Arial" w:eastAsia="Montserrat" w:hAnsi="Arial" w:cs="Arial"/>
+              </w:rPr>
+              <w:t>}</w:t>
             </w:r>
           </w:p>
         </w:tc>
@@ -700,6 +788,9 @@
           </w:tcPr>
           <w:p>
             <w:pPr>
+              <w:tabs>
+                <w:tab w:val="left" w:pos="1692"/>
+              </w:tabs>
               <w:jc w:val="both"/>
               <w:rPr>
                 <w:rFonts w:ascii="Arial" w:eastAsia="Montserrat" w:hAnsi="Arial" w:cs="Arial"/>
@@ -712,6 +803,20 @@
                 <w:b/>
               </w:rPr>
               <w:t>GRUPO:</w:t>
+            </w:r>
+            <w:r>
+              <w:rPr>
+                <w:rFonts w:ascii="Arial" w:eastAsia="Montserrat" w:hAnsi="Arial" w:cs="Arial"/>
+                <w:b/>
+              </w:rPr>
+              <w:tab/>
+            </w:r>
+            <w:r>
+              <w:rPr>
+                <w:rFonts w:ascii="Arial" w:eastAsia="Montserrat" w:hAnsi="Arial" w:cs="Arial"/>
+                <w:b/>
+              </w:rPr>
+              <w:t>{grupo}</w:t>
             </w:r>
           </w:p>
         </w:tc>
@@ -799,7 +904,23 @@
                 <w:rFonts w:ascii="Arial" w:eastAsia="Montserrat" w:hAnsi="Arial" w:cs="Arial"/>
                 <w:b/>
               </w:rPr>
-              <w:t>{objetivoGeneral}</w:t>
+              <w:t>{</w:t>
+            </w:r>
+            <w:proofErr w:type="spellStart"/>
+            <w:r>
+              <w:rPr>
+                <w:rFonts w:ascii="Arial" w:eastAsia="Montserrat" w:hAnsi="Arial" w:cs="Arial"/>
+                <w:b/>
+              </w:rPr>
+              <w:t>objetivoGeneral</w:t>
+            </w:r>
+            <w:proofErr w:type="spellEnd"/>
+            <w:r>
+              <w:rPr>
+                <w:rFonts w:ascii="Arial" w:eastAsia="Montserrat" w:hAnsi="Arial" w:cs="Arial"/>
+                <w:b/>
+              </w:rPr>
+              <w:t>}</w:t>
             </w:r>
           </w:p>
           <w:p>
@@ -1895,7 +2016,23 @@
                 <w:rFonts w:ascii="Arial" w:eastAsia="Montserrat" w:hAnsi="Arial" w:cs="Arial"/>
                 <w:b/>
               </w:rPr>
-              <w:t>{objetivoEspecifico}</w:t>
+              <w:t>{</w:t>
+            </w:r>
+            <w:proofErr w:type="spellStart"/>
+            <w:r>
+              <w:rPr>
+                <w:rFonts w:ascii="Arial" w:eastAsia="Montserrat" w:hAnsi="Arial" w:cs="Arial"/>
+                <w:b/>
+              </w:rPr>
+              <w:t>objetivoEspecifico</w:t>
+            </w:r>
+            <w:proofErr w:type="spellEnd"/>
+            <w:r>
+              <w:rPr>
+                <w:rFonts w:ascii="Arial" w:eastAsia="Montserrat" w:hAnsi="Arial" w:cs="Arial"/>
+                <w:b/>
+              </w:rPr>
+              <w:t>}</w:t>
             </w:r>
           </w:p>
         </w:tc>
@@ -2446,7 +2583,23 @@
                 <w:rFonts w:ascii="Arial" w:eastAsia="Montserrat" w:hAnsi="Arial" w:cs="Arial"/>
                 <w:b/>
               </w:rPr>
-              <w:t>{evaluacion}</w:t>
+              <w:t>{</w:t>
+            </w:r>
+            <w:proofErr w:type="spellStart"/>
+            <w:r>
+              <w:rPr>
+                <w:rFonts w:ascii="Arial" w:eastAsia="Montserrat" w:hAnsi="Arial" w:cs="Arial"/>
+                <w:b/>
+              </w:rPr>
+              <w:t>evaluacion</w:t>
+            </w:r>
+            <w:proofErr w:type="spellEnd"/>
+            <w:r>
+              <w:rPr>
+                <w:rFonts w:ascii="Arial" w:eastAsia="Montserrat" w:hAnsi="Arial" w:cs="Arial"/>
+                <w:b/>
+              </w:rPr>
+              <w:t>}</w:t>
             </w:r>
           </w:p>
           <w:p>
@@ -2478,7 +2631,23 @@
                 <w:rFonts w:ascii="Arial" w:eastAsia="Montserrat" w:hAnsi="Arial" w:cs="Arial"/>
                 <w:b/>
               </w:rPr>
-              <w:t>{/unidadBloques}</w:t>
+              <w:t>{/</w:t>
+            </w:r>
+            <w:proofErr w:type="spellStart"/>
+            <w:r>
+              <w:rPr>
+                <w:rFonts w:ascii="Arial" w:eastAsia="Montserrat" w:hAnsi="Arial" w:cs="Arial"/>
+                <w:b/>
+              </w:rPr>
+              <w:t>unidadBloques</w:t>
+            </w:r>
+            <w:proofErr w:type="spellEnd"/>
+            <w:r>
+              <w:rPr>
+                <w:rFonts w:ascii="Arial" w:eastAsia="Montserrat" w:hAnsi="Arial" w:cs="Arial"/>
+                <w:b/>
+              </w:rPr>
+              <w:t>}</w:t>
             </w:r>
           </w:p>
         </w:tc>

</xml_diff>